<commit_message>
updating to remove decision matrix for now
</commit_message>
<xml_diff>
--- a/TechComm/assignments/recommendation/individual/self-check/ai-prompt-to-check-your-recommendation-report.docx
+++ b/TechComm/assignments/recommendation/individual/self-check/ai-prompt-to-check-your-recommendation-report.docx
@@ -239,34 +239,6 @@
           <w:rFonts w:asciiTheme="majorHAnsi" w:hAnsiTheme="majorHAnsi" w:cstheme="majorHAnsi"/>
           <w:b/>
         </w:rPr>
-        <w:t>Decision Matrix</w:t>
-      </w:r>
-    </w:p>
-    <w:p>
-      <w:pPr>
-        <w:rPr>
-          <w:rFonts w:asciiTheme="majorHAnsi" w:hAnsiTheme="majorHAnsi" w:cstheme="majorHAnsi"/>
-        </w:rPr>
-      </w:pPr>
-      <w:r>
-        <w:rPr>
-          <w:rFonts w:asciiTheme="majorHAnsi" w:hAnsiTheme="majorHAnsi" w:cstheme="majorHAnsi"/>
-        </w:rPr>
-        <w:t>My report includes a decision matrix that compares realistic improvement options using relevant criteria. I apply the criteria consistently, make the basis for comparison understandable, and explain the tradeoffs rather than simply repeating the matrix entries.</w:t>
-      </w:r>
-    </w:p>
-    <w:p>
-      <w:pPr>
-        <w:spacing w:before="120" w:after="20"/>
-        <w:rPr>
-          <w:rFonts w:asciiTheme="majorHAnsi" w:hAnsiTheme="majorHAnsi" w:cstheme="majorHAnsi"/>
-        </w:rPr>
-      </w:pPr>
-      <w:r>
-        <w:rPr>
-          <w:rFonts w:asciiTheme="majorHAnsi" w:hAnsiTheme="majorHAnsi" w:cstheme="majorHAnsi"/>
-          <w:b/>
-        </w:rPr>
         <w:t>Recommendations &amp; Practicality</w:t>
       </w:r>
     </w:p>
@@ -313,6 +285,34 @@
     </w:p>
     <w:p>
       <w:pPr>
+        <w:spacing w:before="120" w:after="20"/>
+        <w:rPr>
+          <w:rFonts w:asciiTheme="majorHAnsi" w:hAnsiTheme="majorHAnsi" w:cstheme="majorHAnsi"/>
+        </w:rPr>
+      </w:pPr>
+      <w:r>
+        <w:rPr>
+          <w:rFonts w:asciiTheme="majorHAnsi" w:hAnsiTheme="majorHAnsi" w:cstheme="majorHAnsi"/>
+          <w:b/>
+        </w:rPr>
+        <w:t>Research Sources</w:t>
+      </w:r>
+    </w:p>
+    <w:p>
+      <w:pPr>
+        <w:rPr>
+          <w:rFonts w:asciiTheme="majorHAnsi" w:hAnsiTheme="majorHAnsi" w:cstheme="majorHAnsi"/>
+        </w:rPr>
+      </w:pPr>
+      <w:r>
+        <w:rPr>
+          <w:rFonts w:asciiTheme="majorHAnsi" w:hAnsiTheme="majorHAnsi" w:cstheme="majorHAnsi"/>
+        </w:rPr>
+        <w:t>My report uses at least six credible outside sources, including relevant standards, guidelines, research findings, or professional recommendations. I use these sources meaningfully to establish evaluation criteria and support my findings, conclusions, and recommendations.</w:t>
+      </w:r>
+    </w:p>
+    <w:p>
+      <w:pPr>
         <w:spacing w:after="200"/>
         <w:rPr>
           <w:rFonts w:asciiTheme="majorHAnsi" w:hAnsiTheme="majorHAnsi" w:cstheme="majorHAnsi"/>
@@ -340,34 +340,6 @@
           <w:b/>
         </w:rPr>
         <w:lastRenderedPageBreak/>
-        <w:t>Research Sources</w:t>
-      </w:r>
-    </w:p>
-    <w:p>
-      <w:pPr>
-        <w:rPr>
-          <w:rFonts w:asciiTheme="majorHAnsi" w:hAnsiTheme="majorHAnsi" w:cstheme="majorHAnsi"/>
-        </w:rPr>
-      </w:pPr>
-      <w:r>
-        <w:rPr>
-          <w:rFonts w:asciiTheme="majorHAnsi" w:hAnsiTheme="majorHAnsi" w:cstheme="majorHAnsi"/>
-        </w:rPr>
-        <w:t>My report uses at least six credible outside sources, including relevant standards, guidelines, research findings, or professional recommendations. I use these sources meaningfully to establish evaluation criteria and support my findings, conclusions, and recommendations.</w:t>
-      </w:r>
-    </w:p>
-    <w:p>
-      <w:pPr>
-        <w:spacing w:before="120" w:after="20"/>
-        <w:rPr>
-          <w:rFonts w:asciiTheme="majorHAnsi" w:hAnsiTheme="majorHAnsi" w:cstheme="majorHAnsi"/>
-        </w:rPr>
-      </w:pPr>
-      <w:r>
-        <w:rPr>
-          <w:rFonts w:asciiTheme="majorHAnsi" w:hAnsiTheme="majorHAnsi" w:cstheme="majorHAnsi"/>
-          <w:b/>
-        </w:rPr>
         <w:t>Source Documentation</w:t>
       </w:r>
     </w:p>
@@ -409,7 +381,7 @@
         <w:rPr>
           <w:rFonts w:asciiTheme="majorHAnsi" w:hAnsiTheme="majorHAnsi" w:cstheme="majorHAnsi"/>
         </w:rPr>
-        <w:t>In addition to my decision matrix, my report includes at least three relevant visual aids, such as screenshots, photographs, tables, charts, or diagrams. My visuals help readers understand the communication problems, findings, or proposed improvements. I did not use clip art.</w:t>
+        <w:t>My report includes at least three relevant visual aids, such as screenshots, photographs, tables, charts, or diagrams. My visuals help readers understand the communication problems, findings, or proposed improvements. I did not use clip art.</w:t>
       </w:r>
     </w:p>
     <w:p>
@@ -590,7 +562,7 @@
         <w:rPr>
           <w:rFonts w:asciiTheme="majorHAnsi" w:hAnsiTheme="majorHAnsi" w:cstheme="majorHAnsi"/>
         </w:rPr>
-        <w:t>Pay particular attention to whether the evaluation criteria are research-grounded, findings are supported by concrete document examples, conclusions explain effects on users, the decision matrix makes comparisons and tradeoffs clear, and recommendations are specific, prioritized, and feasible.</w:t>
+        <w:t>Pay particular attention to whether the evaluation criteria are research-grounded, findings are supported by concrete document examples, conclusions explain effects on users, recommendations are specific, prioritized, and feasible.</w:t>
       </w:r>
     </w:p>
     <w:p>

</xml_diff>

<commit_message>
fixing abstract error; removing unneeded files
</commit_message>
<xml_diff>
--- a/TechComm/assignments/recommendation/individual/self-check/ai-prompt-to-check-your-recommendation-report.docx
+++ b/TechComm/assignments/recommendation/individual/self-check/ai-prompt-to-check-your-recommendation-report.docx
@@ -112,7 +112,31 @@
         <w:rPr>
           <w:rFonts w:asciiTheme="majorHAnsi" w:hAnsiTheme="majorHAnsi" w:cstheme="majorHAnsi"/>
         </w:rPr>
-        <w:t>My report includes all 11 required sections: Letter of Transmittal, Title Page, Table of Contents, Abstract, Executive Summary, Introduction, Methods, Results, Conclusions, Recommendations, and References. I have included optional sections only when appropriate and have not added a separate cover.</w:t>
+        <w:t xml:space="preserve">My report includes all 11 required sections: Letter of Transmittal, Title Page, </w:t>
+      </w:r>
+      <w:r>
+        <w:rPr>
+          <w:rFonts w:asciiTheme="majorHAnsi" w:hAnsiTheme="majorHAnsi" w:cstheme="majorHAnsi"/>
+        </w:rPr>
+        <w:t>Abstract</w:t>
+      </w:r>
+      <w:r>
+        <w:rPr>
+          <w:rFonts w:asciiTheme="majorHAnsi" w:hAnsiTheme="majorHAnsi" w:cstheme="majorHAnsi"/>
+        </w:rPr>
+        <w:t>,</w:t>
+      </w:r>
+      <w:r>
+        <w:rPr>
+          <w:rFonts w:asciiTheme="majorHAnsi" w:hAnsiTheme="majorHAnsi" w:cstheme="majorHAnsi"/>
+        </w:rPr>
+        <w:t xml:space="preserve"> </w:t>
+      </w:r>
+      <w:r>
+        <w:rPr>
+          <w:rFonts w:asciiTheme="majorHAnsi" w:hAnsiTheme="majorHAnsi" w:cstheme="majorHAnsi"/>
+        </w:rPr>
+        <w:t>Table of Contents, Executive Summary, Introduction, Methods, Results, Conclusions, Recommendations, and References. I have included optional sections only when appropriate and have not added a separate cover.</w:t>
       </w:r>
     </w:p>
     <w:p>

</xml_diff>